<commit_message>
Integrate Update_User_Profile API with frontend user table
- Updated AllOwnerTable component to call backend Update_User_Profile endpoint when updating a user.
- handleSave function now sends a PUT request to:
  http://localhost/instrument-care-back-end/public/admin/users/{id}
  with JSON body containing the updated user data.
- Local state is updated on successful response, and alerts are shown for success or errors.
- No other parts of the component were modified; existing view and delete functionality remain unchanged.
- Prepares frontend for full backend integration of user profile updates.
</commit_message>
<xml_diff>
--- a/Instrument Care Guide.docx
+++ b/Instrument Care Guide.docx
@@ -345,7 +345,7 @@
           </mc:Choice>
           <mc:Fallback>
             <w:pict>
-              <v:shapetype w14:anchorId="23820C97" id="_x0000_t32" coordsize="21600,21600" o:spt="32" o:oned="t" path="m,l21600,21600e" filled="f">
+              <v:shapetype w14:anchorId="66E10C12" id="_x0000_t32" coordsize="21600,21600" o:spt="32" o:oned="t" path="m,l21600,21600e" filled="f">
                 <v:path arrowok="t" fillok="f" o:connecttype="none"/>
                 <o:lock v:ext="edit" shapetype="t"/>
               </v:shapetype>
@@ -835,7 +835,7 @@
           </mc:Choice>
           <mc:Fallback>
             <w:pict>
-              <v:shape w14:anchorId="5FC08F4D" id="Straight Arrow Connector 3" o:spid="_x0000_s1026" type="#_x0000_t32" style="position:absolute;margin-left:191.7pt;margin-top:-11.05pt;width:25.6pt;height:73.3pt;z-index:251715584;visibility:visible;mso-wrap-style:square;mso-width-percent:0;mso-height-percent:0;mso-wrap-distance-left:9pt;mso-wrap-distance-top:0;mso-wrap-distance-right:9pt;mso-wrap-distance-bottom:0;mso-position-horizontal:absolute;mso-position-horizontal-relative:text;mso-position-vertical:absolute;mso-position-vertical-relative:text;mso-width-percent:0;mso-height-percent:0;mso-width-relative:margin;mso-height-relative:margin" o:gfxdata="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" strokecolor="red">
+              <v:shape w14:anchorId="2F800C67" id="Straight Arrow Connector 3" o:spid="_x0000_s1026" type="#_x0000_t32" style="position:absolute;margin-left:191.7pt;margin-top:-11.05pt;width:25.6pt;height:73.3pt;z-index:251715584;visibility:visible;mso-wrap-style:square;mso-width-percent:0;mso-height-percent:0;mso-wrap-distance-left:9pt;mso-wrap-distance-top:0;mso-wrap-distance-right:9pt;mso-wrap-distance-bottom:0;mso-position-horizontal:absolute;mso-position-horizontal-relative:text;mso-position-vertical:absolute;mso-position-vertical-relative:text;mso-width-percent:0;mso-height-percent:0;mso-width-relative:margin;mso-height-relative:margin" o:gfxdata="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" strokecolor="red">
                 <v:stroke endarrow="block" joinstyle="miter"/>
               </v:shape>
             </w:pict>
@@ -1047,7 +1047,7 @@
           </mc:Choice>
           <mc:Fallback>
             <w:pict>
-              <v:shape w14:anchorId="1D248A7D" id="Straight Arrow Connector 2" o:spid="_x0000_s1026" type="#_x0000_t32" style="position:absolute;margin-left:168.75pt;margin-top:7.5pt;width:19.85pt;height:54.75pt;z-index:251713536;visibility:visible;mso-wrap-style:square;mso-width-percent:0;mso-height-percent:0;mso-wrap-distance-left:9pt;mso-wrap-distance-top:0;mso-wrap-distance-right:9pt;mso-wrap-distance-bottom:0;mso-position-horizontal:absolute;mso-position-horizontal-relative:text;mso-position-vertical:absolute;mso-position-vertical-relative:text;mso-width-percent:0;mso-height-percent:0;mso-width-relative:margin;mso-height-relative:margin" o:gfxdata="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" strokecolor="red">
+              <v:shape w14:anchorId="5841D0CF" id="Straight Arrow Connector 2" o:spid="_x0000_s1026" type="#_x0000_t32" style="position:absolute;margin-left:168.75pt;margin-top:7.5pt;width:19.85pt;height:54.75pt;z-index:251713536;visibility:visible;mso-wrap-style:square;mso-width-percent:0;mso-height-percent:0;mso-wrap-distance-left:9pt;mso-wrap-distance-top:0;mso-wrap-distance-right:9pt;mso-wrap-distance-bottom:0;mso-position-horizontal:absolute;mso-position-horizontal-relative:text;mso-position-vertical:absolute;mso-position-vertical-relative:text;mso-width-percent:0;mso-height-percent:0;mso-width-relative:margin;mso-height-relative:margin" o:gfxdata="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" strokecolor="red">
                 <v:stroke endarrow="block" joinstyle="miter"/>
               </v:shape>
             </w:pict>
@@ -1294,7 +1294,7 @@
           </mc:Choice>
           <mc:Fallback>
             <w:pict>
-              <v:shape w14:anchorId="53FFE752" id="Straight Arrow Connector 6" o:spid="_x0000_s1026" type="#_x0000_t32" style="position:absolute;margin-left:359.6pt;margin-top:.3pt;width:14.55pt;height:37.95pt;z-index:251721728;visibility:visible;mso-wrap-style:square;mso-wrap-distance-left:9pt;mso-wrap-distance-top:0;mso-wrap-distance-right:9pt;mso-wrap-distance-bottom:0;mso-position-horizontal:absolute;mso-position-horizontal-relative:text;mso-position-vertical:absolute;mso-position-vertical-relative:text" o:gfxdata="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" strokecolor="red">
+              <v:shape w14:anchorId="1993AF3E" id="Straight Arrow Connector 6" o:spid="_x0000_s1026" type="#_x0000_t32" style="position:absolute;margin-left:359.6pt;margin-top:.3pt;width:14.55pt;height:37.95pt;z-index:251721728;visibility:visible;mso-wrap-style:square;mso-wrap-distance-left:9pt;mso-wrap-distance-top:0;mso-wrap-distance-right:9pt;mso-wrap-distance-bottom:0;mso-position-horizontal:absolute;mso-position-horizontal-relative:text;mso-position-vertical:absolute;mso-position-vertical-relative:text" o:gfxdata="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" strokecolor="red">
                 <v:stroke endarrow="block" joinstyle="miter"/>
               </v:shape>
             </w:pict>
@@ -1363,7 +1363,7 @@
           </mc:Choice>
           <mc:Fallback>
             <w:pict>
-              <v:shape w14:anchorId="242B2966" id="Straight Arrow Connector 4" o:spid="_x0000_s1026" type="#_x0000_t32" style="position:absolute;margin-left:239pt;margin-top:.3pt;width:14.55pt;height:37.95pt;z-index:251717632;visibility:visible;mso-wrap-style:square;mso-wrap-distance-left:9pt;mso-wrap-distance-top:0;mso-wrap-distance-right:9pt;mso-wrap-distance-bottom:0;mso-position-horizontal:absolute;mso-position-horizontal-relative:text;mso-position-vertical:absolute;mso-position-vertical-relative:text" o:gfxdata="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" strokecolor="red">
+              <v:shape w14:anchorId="03FE6D1A" id="Straight Arrow Connector 4" o:spid="_x0000_s1026" type="#_x0000_t32" style="position:absolute;margin-left:239pt;margin-top:.3pt;width:14.55pt;height:37.95pt;z-index:251717632;visibility:visible;mso-wrap-style:square;mso-wrap-distance-left:9pt;mso-wrap-distance-top:0;mso-wrap-distance-right:9pt;mso-wrap-distance-bottom:0;mso-position-horizontal:absolute;mso-position-horizontal-relative:text;mso-position-vertical:absolute;mso-position-vertical-relative:text" o:gfxdata="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" strokecolor="red">
                 <v:stroke endarrow="block" joinstyle="miter"/>
               </v:shape>
             </w:pict>
@@ -1436,7 +1436,7 @@
           </mc:Choice>
           <mc:Fallback>
             <w:pict>
-              <v:shape w14:anchorId="27C39834" id="Straight Arrow Connector 1" o:spid="_x0000_s1026" type="#_x0000_t32" style="position:absolute;margin-left:2in;margin-top:1.6pt;width:14.1pt;height:37.95pt;z-index:251712512;visibility:visible;mso-wrap-style:square;mso-width-percent:0;mso-wrap-distance-left:9pt;mso-wrap-distance-top:0;mso-wrap-distance-right:9pt;mso-wrap-distance-bottom:0;mso-position-horizontal:absolute;mso-position-horizontal-relative:text;mso-position-vertical:absolute;mso-position-vertical-relative:text;mso-width-percent:0;mso-width-relative:margin" o:gfxdata="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" strokecolor="red">
+              <v:shape w14:anchorId="4E8CAA8C" id="Straight Arrow Connector 1" o:spid="_x0000_s1026" type="#_x0000_t32" style="position:absolute;margin-left:2in;margin-top:1.6pt;width:14.1pt;height:37.95pt;z-index:251712512;visibility:visible;mso-wrap-style:square;mso-width-percent:0;mso-wrap-distance-left:9pt;mso-wrap-distance-top:0;mso-wrap-distance-right:9pt;mso-wrap-distance-bottom:0;mso-position-horizontal:absolute;mso-position-horizontal-relative:text;mso-position-vertical:absolute;mso-position-vertical-relative:text;mso-width-percent:0;mso-width-relative:margin" o:gfxdata="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" strokecolor="red">
                 <v:stroke endarrow="block" joinstyle="miter"/>
               </v:shape>
             </w:pict>
@@ -1525,7 +1525,7 @@
           </mc:Choice>
           <mc:Fallback>
             <w:pict>
-              <v:rect w14:anchorId="34528292" id="Rectangle 4" o:spid="_x0000_s1026" style="position:absolute;margin-left:50.25pt;margin-top:10.65pt;width:350.3pt;height:14.65pt;z-index:251660288;visibility:visible;mso-wrap-style:square;mso-width-percent:0;mso-height-percent:0;mso-wrap-distance-left:9pt;mso-wrap-distance-top:0;mso-wrap-distance-right:9pt;mso-wrap-distance-bottom:0;mso-position-horizontal:absolute;mso-position-horizontal-relative:text;mso-position-vertical:absolute;mso-position-vertical-relative:text;mso-width-percent:0;mso-height-percent:0;mso-width-relative:margin;mso-height-relative:margin;v-text-anchor:middle" o:gfxdata="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" filled="f" strokecolor="#e00"/>
+              <v:rect w14:anchorId="3F833693" id="Rectangle 4" o:spid="_x0000_s1026" style="position:absolute;margin-left:50.25pt;margin-top:10.65pt;width:350.3pt;height:14.65pt;z-index:251660288;visibility:visible;mso-wrap-style:square;mso-width-percent:0;mso-height-percent:0;mso-wrap-distance-left:9pt;mso-wrap-distance-top:0;mso-wrap-distance-right:9pt;mso-wrap-distance-bottom:0;mso-position-horizontal:absolute;mso-position-horizontal-relative:text;mso-position-vertical:absolute;mso-position-vertical-relative:text;mso-width-percent:0;mso-height-percent:0;mso-width-relative:margin;mso-height-relative:margin;v-text-anchor:middle" o:gfxdata="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" filled="f" strokecolor="#e00"/>
             </w:pict>
           </mc:Fallback>
         </mc:AlternateContent>
@@ -1613,7 +1613,7 @@
           </mc:Choice>
           <mc:Fallback>
             <w:pict>
-              <v:rect w14:anchorId="44AC0FC1" id="Rectangle 8" o:spid="_x0000_s1026" style="position:absolute;margin-left:50.65pt;margin-top:3.8pt;width:349.85pt;height:93.9pt;z-index:251676672;visibility:visible;mso-wrap-style:square;mso-width-percent:0;mso-height-percent:0;mso-wrap-distance-left:9pt;mso-wrap-distance-top:0;mso-wrap-distance-right:9pt;mso-wrap-distance-bottom:0;mso-position-horizontal:absolute;mso-position-horizontal-relative:text;mso-position-vertical:absolute;mso-position-vertical-relative:text;mso-width-percent:0;mso-height-percent:0;mso-width-relative:margin;mso-height-relative:margin;v-text-anchor:middle" o:gfxdata="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" filled="f" strokecolor="#e00" strokeweight="1pt"/>
+              <v:rect w14:anchorId="31BDF62F" id="Rectangle 8" o:spid="_x0000_s1026" style="position:absolute;margin-left:50.65pt;margin-top:3.8pt;width:349.85pt;height:93.9pt;z-index:251676672;visibility:visible;mso-wrap-style:square;mso-width-percent:0;mso-height-percent:0;mso-wrap-distance-left:9pt;mso-wrap-distance-top:0;mso-wrap-distance-right:9pt;mso-wrap-distance-bottom:0;mso-position-horizontal:absolute;mso-position-horizontal-relative:text;mso-position-vertical:absolute;mso-position-vertical-relative:text;mso-width-percent:0;mso-height-percent:0;mso-width-relative:margin;mso-height-relative:margin;v-text-anchor:middle" o:gfxdata="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" filled="f" strokecolor="#e00" strokeweight="1pt"/>
             </w:pict>
           </mc:Fallback>
         </mc:AlternateContent>
@@ -1873,7 +1873,7 @@
           </mc:Choice>
           <mc:Fallback>
             <w:pict>
-              <v:rect w14:anchorId="0B58FF90" id="Rectangle 5" o:spid="_x0000_s1026" style="position:absolute;margin-left:186pt;margin-top:22.1pt;width:80pt;height:17.25pt;z-index:251661312;visibility:visible;mso-wrap-style:square;mso-width-percent:0;mso-wrap-distance-left:9pt;mso-wrap-distance-top:0;mso-wrap-distance-right:9pt;mso-wrap-distance-bottom:0;mso-position-horizontal:absolute;mso-position-horizontal-relative:text;mso-position-vertical:absolute;mso-position-vertical-relative:text;mso-width-percent:0;mso-width-relative:margin;v-text-anchor:middle" o:gfxdata="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" filled="f" strokecolor="#e00" strokeweight="1pt"/>
+              <v:rect w14:anchorId="1F7B1481" id="Rectangle 5" o:spid="_x0000_s1026" style="position:absolute;margin-left:186pt;margin-top:22.1pt;width:80pt;height:17.25pt;z-index:251661312;visibility:visible;mso-wrap-style:square;mso-width-percent:0;mso-wrap-distance-left:9pt;mso-wrap-distance-top:0;mso-wrap-distance-right:9pt;mso-wrap-distance-bottom:0;mso-position-horizontal:absolute;mso-position-horizontal-relative:text;mso-position-vertical:absolute;mso-position-vertical-relative:text;mso-width-percent:0;mso-width-relative:margin;v-text-anchor:middle" o:gfxdata="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" filled="f" strokecolor="#e00" strokeweight="1pt"/>
             </w:pict>
           </mc:Fallback>
         </mc:AlternateContent>
@@ -2200,7 +2200,7 @@
           </mc:Choice>
           <mc:Fallback>
             <w:pict>
-              <v:shape w14:anchorId="2E2BA9F6" id="Straight Arrow Connector 15" o:spid="_x0000_s1026" type="#_x0000_t32" style="position:absolute;margin-left:43.1pt;margin-top:7pt;width:148.6pt;height:0;z-index:251734016;visibility:visible;mso-wrap-style:square;mso-width-percent:0;mso-height-percent:0;mso-wrap-distance-left:9pt;mso-wrap-distance-top:0;mso-wrap-distance-right:9pt;mso-wrap-distance-bottom:0;mso-position-horizontal:absolute;mso-position-horizontal-relative:text;mso-position-vertical:absolute;mso-position-vertical-relative:text;mso-width-percent:0;mso-height-percent:0;mso-width-relative:margin;mso-height-relative:margin" o:gfxdata="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" strokecolor="red">
+              <v:shape w14:anchorId="404E8AAA" id="Straight Arrow Connector 15" o:spid="_x0000_s1026" type="#_x0000_t32" style="position:absolute;margin-left:43.1pt;margin-top:7pt;width:148.6pt;height:0;z-index:251734016;visibility:visible;mso-wrap-style:square;mso-width-percent:0;mso-height-percent:0;mso-wrap-distance-left:9pt;mso-wrap-distance-top:0;mso-wrap-distance-right:9pt;mso-wrap-distance-bottom:0;mso-position-horizontal:absolute;mso-position-horizontal-relative:text;mso-position-vertical:absolute;mso-position-vertical-relative:text;mso-width-percent:0;mso-height-percent:0;mso-width-relative:margin;mso-height-relative:margin" o:gfxdata="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" strokecolor="red">
                 <v:stroke endarrow="block" joinstyle="miter"/>
               </v:shape>
             </w:pict>
@@ -2275,7 +2275,7 @@
           </mc:Choice>
           <mc:Fallback>
             <w:pict>
-              <v:shape w14:anchorId="020E86DD" id="Straight Arrow Connector 19" o:spid="_x0000_s1026" type="#_x0000_t32" style="position:absolute;margin-left:260pt;margin-top:7pt;width:154pt;height:0;flip:x;z-index:251739136;visibility:visible;mso-wrap-style:square;mso-width-percent:0;mso-height-percent:0;mso-wrap-distance-left:9pt;mso-wrap-distance-top:0;mso-wrap-distance-right:9pt;mso-wrap-distance-bottom:0;mso-position-horizontal:absolute;mso-position-horizontal-relative:text;mso-position-vertical:absolute;mso-position-vertical-relative:text;mso-width-percent:0;mso-height-percent:0;mso-width-relative:margin;mso-height-relative:margin" o:gfxdata="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" strokecolor="red">
+              <v:shape w14:anchorId="7A8A0AFE" id="Straight Arrow Connector 19" o:spid="_x0000_s1026" type="#_x0000_t32" style="position:absolute;margin-left:260pt;margin-top:7pt;width:154pt;height:0;flip:x;z-index:251739136;visibility:visible;mso-wrap-style:square;mso-width-percent:0;mso-height-percent:0;mso-wrap-distance-left:9pt;mso-wrap-distance-top:0;mso-wrap-distance-right:9pt;mso-wrap-distance-bottom:0;mso-position-horizontal:absolute;mso-position-horizontal-relative:text;mso-position-vertical:absolute;mso-position-vertical-relative:text;mso-width-percent:0;mso-height-percent:0;mso-width-relative:margin;mso-height-relative:margin" o:gfxdata="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" strokecolor="red">
                 <v:stroke endarrow="block" joinstyle="miter"/>
               </v:shape>
             </w:pict>
@@ -2474,7 +2474,7 @@
           </mc:Choice>
           <mc:Fallback>
             <w:pict>
-              <v:rect w14:anchorId="4DA5F4CC" id="Rectangle 8" o:spid="_x0000_s1026" style="position:absolute;margin-left:50.75pt;margin-top:9.6pt;width:349.75pt;height:107.05pt;z-index:251678720;visibility:visible;mso-wrap-style:square;mso-width-percent:0;mso-height-percent:0;mso-wrap-distance-left:9pt;mso-wrap-distance-top:0;mso-wrap-distance-right:9pt;mso-wrap-distance-bottom:0;mso-position-horizontal:absolute;mso-position-horizontal-relative:text;mso-position-vertical:absolute;mso-position-vertical-relative:text;mso-width-percent:0;mso-height-percent:0;mso-width-relative:margin;mso-height-relative:margin;v-text-anchor:middle" o:gfxdata="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" filled="f" strokecolor="#e00" strokeweight="1pt"/>
+              <v:rect w14:anchorId="0EBC5216" id="Rectangle 8" o:spid="_x0000_s1026" style="position:absolute;margin-left:50.75pt;margin-top:9.6pt;width:349.75pt;height:107.05pt;z-index:251678720;visibility:visible;mso-wrap-style:square;mso-width-percent:0;mso-height-percent:0;mso-wrap-distance-left:9pt;mso-wrap-distance-top:0;mso-wrap-distance-right:9pt;mso-wrap-distance-bottom:0;mso-position-horizontal:absolute;mso-position-horizontal-relative:text;mso-position-vertical:absolute;mso-position-vertical-relative:text;mso-width-percent:0;mso-height-percent:0;mso-width-relative:margin;mso-height-relative:margin;v-text-anchor:middle" o:gfxdata="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" filled="f" strokecolor="#e00" strokeweight="1pt"/>
             </w:pict>
           </mc:Fallback>
         </mc:AlternateContent>
@@ -2590,7 +2590,7 @@
           </mc:Choice>
           <mc:Fallback>
             <w:pict>
-              <v:rect w14:anchorId="3F590375" id="Rectangle 8" o:spid="_x0000_s1026" style="position:absolute;margin-left:50.25pt;margin-top:.6pt;width:350.65pt;height:120.15pt;z-index:251680768;visibility:visible;mso-wrap-style:square;mso-width-percent:0;mso-height-percent:0;mso-wrap-distance-left:9pt;mso-wrap-distance-top:0;mso-wrap-distance-right:9pt;mso-wrap-distance-bottom:0;mso-position-horizontal:absolute;mso-position-horizontal-relative:text;mso-position-vertical:absolute;mso-position-vertical-relative:text;mso-width-percent:0;mso-height-percent:0;mso-width-relative:margin;mso-height-relative:margin;v-text-anchor:middle" o:gfxdata="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" filled="f" strokecolor="#e00" strokeweight="1pt"/>
+              <v:rect w14:anchorId="62698895" id="Rectangle 8" o:spid="_x0000_s1026" style="position:absolute;margin-left:50.25pt;margin-top:.6pt;width:350.65pt;height:120.15pt;z-index:251680768;visibility:visible;mso-wrap-style:square;mso-width-percent:0;mso-height-percent:0;mso-wrap-distance-left:9pt;mso-wrap-distance-top:0;mso-wrap-distance-right:9pt;mso-wrap-distance-bottom:0;mso-position-horizontal:absolute;mso-position-horizontal-relative:text;mso-position-vertical:absolute;mso-position-vertical-relative:text;mso-width-percent:0;mso-height-percent:0;mso-width-relative:margin;mso-height-relative:margin;v-text-anchor:middle" o:gfxdata="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" filled="f" strokecolor="#e00" strokeweight="1pt"/>
             </w:pict>
           </mc:Fallback>
         </mc:AlternateContent>
@@ -2825,7 +2825,7 @@
           </mc:Choice>
           <mc:Fallback>
             <w:pict>
-              <v:rect w14:anchorId="64AB393B" id="Rectangle 6" o:spid="_x0000_s1026" style="position:absolute;margin-left:222.4pt;margin-top:10.95pt;width:38.8pt;height:14.65pt;z-index:251662336;visibility:visible;mso-wrap-style:square;mso-width-percent:0;mso-wrap-distance-left:9pt;mso-wrap-distance-top:0;mso-wrap-distance-right:9pt;mso-wrap-distance-bottom:0;mso-position-horizontal:absolute;mso-position-horizontal-relative:text;mso-position-vertical:absolute;mso-position-vertical-relative:text;mso-width-percent:0;mso-width-relative:margin;v-text-anchor:middle" o:gfxdata="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" filled="f" strokecolor="#e00" strokeweight="1pt"/>
+              <v:rect w14:anchorId="2A6B5246" id="Rectangle 6" o:spid="_x0000_s1026" style="position:absolute;margin-left:222.4pt;margin-top:10.95pt;width:38.8pt;height:14.65pt;z-index:251662336;visibility:visible;mso-wrap-style:square;mso-width-percent:0;mso-wrap-distance-left:9pt;mso-wrap-distance-top:0;mso-wrap-distance-right:9pt;mso-wrap-distance-bottom:0;mso-position-horizontal:absolute;mso-position-horizontal-relative:text;mso-position-vertical:absolute;mso-position-vertical-relative:text;mso-width-percent:0;mso-width-relative:margin;v-text-anchor:middle" o:gfxdata="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" filled="f" strokecolor="#e00" strokeweight="1pt"/>
             </w:pict>
           </mc:Fallback>
         </mc:AlternateContent>
@@ -2898,7 +2898,7 @@
           </mc:Choice>
           <mc:Fallback>
             <w:pict>
-              <v:shape w14:anchorId="1C390184" id="Straight Arrow Connector 22" o:spid="_x0000_s1026" type="#_x0000_t32" style="position:absolute;margin-left:254.9pt;margin-top:18.05pt;width:154pt;height:0;flip:x;z-index:251745280;visibility:visible;mso-wrap-style:square;mso-width-percent:0;mso-height-percent:0;mso-wrap-distance-left:9pt;mso-wrap-distance-top:0;mso-wrap-distance-right:9pt;mso-wrap-distance-bottom:0;mso-position-horizontal:absolute;mso-position-horizontal-relative:text;mso-position-vertical:absolute;mso-position-vertical-relative:text;mso-width-percent:0;mso-height-percent:0;mso-width-relative:margin;mso-height-relative:margin" o:gfxdata="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" strokecolor="red">
+              <v:shape w14:anchorId="058F32BC" id="Straight Arrow Connector 22" o:spid="_x0000_s1026" type="#_x0000_t32" style="position:absolute;margin-left:254.9pt;margin-top:18.05pt;width:154pt;height:0;flip:x;z-index:251745280;visibility:visible;mso-wrap-style:square;mso-width-percent:0;mso-height-percent:0;mso-wrap-distance-left:9pt;mso-wrap-distance-top:0;mso-wrap-distance-right:9pt;mso-wrap-distance-bottom:0;mso-position-horizontal:absolute;mso-position-horizontal-relative:text;mso-position-vertical:absolute;mso-position-vertical-relative:text;mso-width-percent:0;mso-height-percent:0;mso-width-relative:margin;mso-height-relative:margin" o:gfxdata="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" strokecolor="red">
                 <v:stroke endarrow="block" joinstyle="miter"/>
               </v:shape>
             </w:pict>
@@ -3104,7 +3104,7 @@
           </mc:Choice>
           <mc:Fallback>
             <w:pict>
-              <v:rect w14:anchorId="2CF2B038" id="Rectangle 8" o:spid="_x0000_s1026" style="position:absolute;margin-left:49.8pt;margin-top:5.45pt;width:350.65pt;height:87.55pt;z-index:251682816;visibility:visible;mso-wrap-style:square;mso-width-percent:0;mso-height-percent:0;mso-wrap-distance-left:9pt;mso-wrap-distance-top:0;mso-wrap-distance-right:9pt;mso-wrap-distance-bottom:0;mso-position-horizontal:absolute;mso-position-horizontal-relative:margin;mso-position-vertical:absolute;mso-position-vertical-relative:text;mso-width-percent:0;mso-height-percent:0;mso-width-relative:margin;mso-height-relative:margin;v-text-anchor:middle" o:gfxdata="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" filled="f" strokecolor="#e00" strokeweight="1pt">
+              <v:rect w14:anchorId="4E171F36" id="Rectangle 8" o:spid="_x0000_s1026" style="position:absolute;margin-left:49.8pt;margin-top:5.45pt;width:350.65pt;height:87.55pt;z-index:251682816;visibility:visible;mso-wrap-style:square;mso-width-percent:0;mso-height-percent:0;mso-wrap-distance-left:9pt;mso-wrap-distance-top:0;mso-wrap-distance-right:9pt;mso-wrap-distance-bottom:0;mso-position-horizontal:absolute;mso-position-horizontal-relative:margin;mso-position-vertical:absolute;mso-position-vertical-relative:text;mso-width-percent:0;mso-height-percent:0;mso-width-relative:margin;mso-height-relative:margin;v-text-anchor:middle" o:gfxdata="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" filled="f" strokecolor="#e00" strokeweight="1pt">
                 <w10:wrap anchorx="margin"/>
               </v:rect>
             </w:pict>
@@ -3215,7 +3215,7 @@
           </mc:Choice>
           <mc:Fallback>
             <w:pict>
-              <v:rect w14:anchorId="6618D007" id="Rectangle 8" o:spid="_x0000_s1026" style="position:absolute;margin-left:50.25pt;margin-top:2.45pt;width:350.25pt;height:97.8pt;z-index:251684864;visibility:visible;mso-wrap-style:square;mso-width-percent:0;mso-height-percent:0;mso-wrap-distance-left:9pt;mso-wrap-distance-top:0;mso-wrap-distance-right:9pt;mso-wrap-distance-bottom:0;mso-position-horizontal:absolute;mso-position-horizontal-relative:margin;mso-position-vertical:absolute;mso-position-vertical-relative:text;mso-width-percent:0;mso-height-percent:0;mso-width-relative:margin;mso-height-relative:margin;v-text-anchor:middle" o:gfxdata="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" filled="f" strokecolor="#e00" strokeweight="1pt">
+              <v:rect w14:anchorId="73F1876D" id="Rectangle 8" o:spid="_x0000_s1026" style="position:absolute;margin-left:50.25pt;margin-top:2.45pt;width:350.25pt;height:97.8pt;z-index:251684864;visibility:visible;mso-wrap-style:square;mso-width-percent:0;mso-height-percent:0;mso-wrap-distance-left:9pt;mso-wrap-distance-top:0;mso-wrap-distance-right:9pt;mso-wrap-distance-bottom:0;mso-position-horizontal:absolute;mso-position-horizontal-relative:margin;mso-position-vertical:absolute;mso-position-vertical-relative:text;mso-width-percent:0;mso-height-percent:0;mso-width-relative:margin;mso-height-relative:margin;v-text-anchor:middle" o:gfxdata="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" filled="f" strokecolor="#e00" strokeweight="1pt">
                 <w10:wrap anchorx="margin"/>
               </v:rect>
             </w:pict>
@@ -3558,7 +3558,7 @@
           </mc:Choice>
           <mc:Fallback>
             <w:pict>
-              <v:shape w14:anchorId="05096DA6" id="Straight Arrow Connector 25" o:spid="_x0000_s1026" type="#_x0000_t32" style="position:absolute;margin-left:41.6pt;margin-top:9.2pt;width:163.55pt;height:0;z-index:251750400;visibility:visible;mso-wrap-style:square;mso-width-percent:0;mso-height-percent:0;mso-wrap-distance-left:9pt;mso-wrap-distance-top:0;mso-wrap-distance-right:9pt;mso-wrap-distance-bottom:0;mso-position-horizontal:absolute;mso-position-horizontal-relative:text;mso-position-vertical:absolute;mso-position-vertical-relative:text;mso-width-percent:0;mso-height-percent:0;mso-width-relative:margin;mso-height-relative:margin" o:gfxdata="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" strokecolor="red">
+              <v:shape w14:anchorId="58FBBF13" id="Straight Arrow Connector 25" o:spid="_x0000_s1026" type="#_x0000_t32" style="position:absolute;margin-left:41.6pt;margin-top:9.2pt;width:163.55pt;height:0;z-index:251750400;visibility:visible;mso-wrap-style:square;mso-width-percent:0;mso-height-percent:0;mso-wrap-distance-left:9pt;mso-wrap-distance-top:0;mso-wrap-distance-right:9pt;mso-wrap-distance-bottom:0;mso-position-horizontal:absolute;mso-position-horizontal-relative:text;mso-position-vertical:absolute;mso-position-vertical-relative:text;mso-width-percent:0;mso-height-percent:0;mso-width-relative:margin;mso-height-relative:margin" o:gfxdata="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" strokecolor="red">
                 <v:stroke endarrow="block" joinstyle="miter"/>
               </v:shape>
             </w:pict>
@@ -3637,7 +3637,7 @@
           </mc:Choice>
           <mc:Fallback>
             <w:pict>
-              <v:rect w14:anchorId="507C1795" id="Rectangle 6" o:spid="_x0000_s1026" style="position:absolute;margin-left:199.45pt;margin-top:1.95pt;width:52.1pt;height:14.65pt;z-index:251664384;visibility:visible;mso-wrap-style:square;mso-width-percent:0;mso-wrap-distance-left:9pt;mso-wrap-distance-top:0;mso-wrap-distance-right:9pt;mso-wrap-distance-bottom:0;mso-position-horizontal:absolute;mso-position-horizontal-relative:margin;mso-position-vertical:absolute;mso-position-vertical-relative:text;mso-width-percent:0;mso-width-relative:margin;v-text-anchor:middle" o:gfxdata="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" filled="f" strokecolor="#e00" strokeweight="1pt">
+              <v:rect w14:anchorId="387BB217" id="Rectangle 6" o:spid="_x0000_s1026" style="position:absolute;margin-left:199.45pt;margin-top:1.95pt;width:52.1pt;height:14.65pt;z-index:251664384;visibility:visible;mso-wrap-style:square;mso-width-percent:0;mso-wrap-distance-left:9pt;mso-wrap-distance-top:0;mso-wrap-distance-right:9pt;mso-wrap-distance-bottom:0;mso-position-horizontal:absolute;mso-position-horizontal-relative:margin;mso-position-vertical:absolute;mso-position-vertical-relative:text;mso-width-percent:0;mso-width-relative:margin;v-text-anchor:middle" o:gfxdata="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" filled="f" strokecolor="#e00" strokeweight="1pt">
                 <w10:wrap anchorx="margin"/>
               </v:rect>
             </w:pict>
@@ -3682,22 +3682,123 @@
       <w:r>
         <w:rPr>
           <w:rFonts w:ascii="Times New Roman" w:hAnsi="Times New Roman" w:cs="Times New Roman"/>
+        </w:rPr>
+        <w:lastRenderedPageBreak/>
+        <w:t>About Page</w:t>
+      </w:r>
+    </w:p>
+    <w:p>
+      <w:pPr>
+        <w:rPr>
+          <w:rFonts w:ascii="Times New Roman" w:hAnsi="Times New Roman" w:cs="Times New Roman"/>
+        </w:rPr>
+      </w:pPr>
+    </w:p>
+    <w:p>
+      <w:pPr>
+        <w:rPr>
+          <w:rFonts w:ascii="Times New Roman" w:hAnsi="Times New Roman" w:cs="Times New Roman"/>
+        </w:rPr>
+      </w:pPr>
+      <w:r>
+        <w:rPr>
+          <w:rFonts w:ascii="Times New Roman" w:hAnsi="Times New Roman" w:cs="Times New Roman"/>
           <w:noProof/>
         </w:rPr>
-        <w:lastRenderedPageBreak/>
+        <mc:AlternateContent>
+          <mc:Choice Requires="wps">
+            <w:drawing>
+              <wp:anchor distT="0" distB="0" distL="114300" distR="114300" simplePos="0" relativeHeight="251670528" behindDoc="0" locked="0" layoutInCell="1" allowOverlap="1" wp14:anchorId="10374970" wp14:editId="6F1F93C7">
+                <wp:simplePos x="0" y="0"/>
+                <wp:positionH relativeFrom="column">
+                  <wp:posOffset>365760</wp:posOffset>
+                </wp:positionH>
+                <wp:positionV relativeFrom="paragraph">
+                  <wp:posOffset>221946</wp:posOffset>
+                </wp:positionV>
+                <wp:extent cx="5037151" cy="1717482"/>
+                <wp:effectExtent l="0" t="0" r="11430" b="16510"/>
+                <wp:wrapNone/>
+                <wp:docPr id="649044424" name="Rectangle 8"/>
+                <wp:cNvGraphicFramePr/>
+                <a:graphic xmlns:a="http://schemas.openxmlformats.org/drawingml/2006/main">
+                  <a:graphicData uri="http://schemas.microsoft.com/office/word/2010/wordprocessingShape">
+                    <wps:wsp>
+                      <wps:cNvSpPr/>
+                      <wps:spPr>
+                        <a:xfrm>
+                          <a:off x="0" y="0"/>
+                          <a:ext cx="5037151" cy="1717482"/>
+                        </a:xfrm>
+                        <a:prstGeom prst="rect">
+                          <a:avLst/>
+                        </a:prstGeom>
+                        <a:noFill/>
+                        <a:ln>
+                          <a:solidFill>
+                            <a:srgbClr val="EE0000"/>
+                          </a:solidFill>
+                        </a:ln>
+                      </wps:spPr>
+                      <wps:style>
+                        <a:lnRef idx="2">
+                          <a:schemeClr val="accent1">
+                            <a:shade val="15000"/>
+                          </a:schemeClr>
+                        </a:lnRef>
+                        <a:fillRef idx="1">
+                          <a:schemeClr val="accent1"/>
+                        </a:fillRef>
+                        <a:effectRef idx="0">
+                          <a:schemeClr val="accent1"/>
+                        </a:effectRef>
+                        <a:fontRef idx="minor">
+                          <a:schemeClr val="lt1"/>
+                        </a:fontRef>
+                      </wps:style>
+                      <wps:bodyPr rot="0" spcFirstLastPara="0" vertOverflow="overflow" horzOverflow="overflow" vert="horz" wrap="square" lIns="91440" tIns="45720" rIns="91440" bIns="45720" numCol="1" spcCol="0" rtlCol="0" fromWordArt="0" anchor="ctr" anchorCtr="0" forceAA="0" compatLnSpc="1">
+                        <a:prstTxWarp prst="textNoShape">
+                          <a:avLst/>
+                        </a:prstTxWarp>
+                        <a:noAutofit/>
+                      </wps:bodyPr>
+                    </wps:wsp>
+                  </a:graphicData>
+                </a:graphic>
+                <wp14:sizeRelH relativeFrom="margin">
+                  <wp14:pctWidth>0</wp14:pctWidth>
+                </wp14:sizeRelH>
+                <wp14:sizeRelV relativeFrom="margin">
+                  <wp14:pctHeight>0</wp14:pctHeight>
+                </wp14:sizeRelV>
+              </wp:anchor>
+            </w:drawing>
+          </mc:Choice>
+          <mc:Fallback>
+            <w:pict>
+              <v:rect w14:anchorId="18026032" id="Rectangle 8" o:spid="_x0000_s1026" style="position:absolute;margin-left:28.8pt;margin-top:17.5pt;width:396.65pt;height:135.25pt;z-index:251670528;visibility:visible;mso-wrap-style:square;mso-width-percent:0;mso-height-percent:0;mso-wrap-distance-left:9pt;mso-wrap-distance-top:0;mso-wrap-distance-right:9pt;mso-wrap-distance-bottom:0;mso-position-horizontal:absolute;mso-position-horizontal-relative:text;mso-position-vertical:absolute;mso-position-vertical-relative:text;mso-width-percent:0;mso-height-percent:0;mso-width-relative:margin;mso-height-relative:margin;v-text-anchor:middle" o:gfxdata="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" filled="f" strokecolor="#e00" strokeweight="1pt"/>
+            </w:pict>
+          </mc:Fallback>
+        </mc:AlternateContent>
+      </w:r>
+      <w:r>
+        <w:rPr>
+          <w:rFonts w:ascii="Times New Roman" w:hAnsi="Times New Roman" w:cs="Times New Roman"/>
+          <w:noProof/>
+        </w:rPr>
         <w:drawing>
-          <wp:anchor distT="0" distB="0" distL="114300" distR="114300" simplePos="0" relativeHeight="251665408" behindDoc="1" locked="0" layoutInCell="1" allowOverlap="1" wp14:anchorId="53000287" wp14:editId="063C3DCC">
+          <wp:anchor distT="0" distB="0" distL="114300" distR="114300" simplePos="0" relativeHeight="251757568" behindDoc="1" locked="0" layoutInCell="1" allowOverlap="1" wp14:anchorId="00B5AC6E" wp14:editId="592B8ACF">
             <wp:simplePos x="0" y="0"/>
             <wp:positionH relativeFrom="margin">
-              <wp:align>center</wp:align>
+              <wp:posOffset>359410</wp:posOffset>
             </wp:positionH>
             <wp:positionV relativeFrom="paragraph">
-              <wp:posOffset>711200</wp:posOffset>
+              <wp:posOffset>48098</wp:posOffset>
             </wp:positionV>
-            <wp:extent cx="4833257" cy="5958304"/>
-            <wp:effectExtent l="0" t="0" r="5715" b="4445"/>
+            <wp:extent cx="5050155" cy="6225540"/>
+            <wp:effectExtent l="0" t="0" r="0" b="3810"/>
             <wp:wrapNone/>
-            <wp:docPr id="1450350338" name="Picture 7"/>
+            <wp:docPr id="29" name="Picture 29"/>
             <wp:cNvGraphicFramePr>
               <a:graphicFrameLocks xmlns:a="http://schemas.openxmlformats.org/drawingml/2006/main" noChangeAspect="1"/>
             </wp:cNvGraphicFramePr>
@@ -3705,7 +3806,7 @@
               <a:graphicData uri="http://schemas.openxmlformats.org/drawingml/2006/picture">
                 <pic:pic xmlns:pic="http://schemas.openxmlformats.org/drawingml/2006/picture">
                   <pic:nvPicPr>
-                    <pic:cNvPr id="1450350338" name="Picture 1450350338"/>
+                    <pic:cNvPr id="29" name="Picture 29"/>
                     <pic:cNvPicPr/>
                   </pic:nvPicPr>
                   <pic:blipFill>
@@ -3723,7 +3824,7 @@
                   <pic:spPr>
                     <a:xfrm>
                       <a:off x="0" y="0"/>
-                      <a:ext cx="4833257" cy="5958304"/>
+                      <a:ext cx="5050155" cy="6225540"/>
                     </a:xfrm>
                     <a:prstGeom prst="rect">
                       <a:avLst/>
@@ -3741,12 +3842,20 @@
           </wp:anchor>
         </w:drawing>
       </w:r>
-      <w:r>
-        <w:rPr>
-          <w:rFonts w:ascii="Times New Roman" w:hAnsi="Times New Roman" w:cs="Times New Roman"/>
-        </w:rPr>
-        <w:t>About Page</w:t>
-      </w:r>
+    </w:p>
+    <w:p>
+      <w:pPr>
+        <w:rPr>
+          <w:rFonts w:ascii="Times New Roman" w:hAnsi="Times New Roman" w:cs="Times New Roman"/>
+        </w:rPr>
+      </w:pPr>
+    </w:p>
+    <w:p>
+      <w:pPr>
+        <w:rPr>
+          <w:rFonts w:ascii="Times New Roman" w:hAnsi="Times New Roman" w:cs="Times New Roman"/>
+        </w:rPr>
+      </w:pPr>
     </w:p>
     <w:p>
       <w:pPr>
@@ -3776,18 +3885,18 @@
         <mc:AlternateContent>
           <mc:Choice Requires="wps">
             <w:drawing>
-              <wp:anchor distT="0" distB="0" distL="114300" distR="114300" simplePos="0" relativeHeight="251670528" behindDoc="0" locked="0" layoutInCell="1" allowOverlap="1" wp14:anchorId="10374970" wp14:editId="1E81E7E0">
+              <wp:anchor distT="0" distB="0" distL="114300" distR="114300" simplePos="0" relativeHeight="251666432" behindDoc="0" locked="0" layoutInCell="1" allowOverlap="1" wp14:anchorId="703FB720" wp14:editId="79CBFAB5">
                 <wp:simplePos x="0" y="0"/>
                 <wp:positionH relativeFrom="column">
-                  <wp:posOffset>450850</wp:posOffset>
+                  <wp:posOffset>2597951</wp:posOffset>
                 </wp:positionH>
                 <wp:positionV relativeFrom="paragraph">
-                  <wp:posOffset>32385</wp:posOffset>
+                  <wp:posOffset>57150</wp:posOffset>
                 </wp:positionV>
-                <wp:extent cx="4819650" cy="1591310"/>
-                <wp:effectExtent l="0" t="0" r="19050" b="27940"/>
+                <wp:extent cx="561975" cy="187739"/>
+                <wp:effectExtent l="0" t="0" r="28575" b="22225"/>
                 <wp:wrapNone/>
-                <wp:docPr id="649044424" name="Rectangle 8"/>
+                <wp:docPr id="1109464233" name="Rectangle 8"/>
                 <wp:cNvGraphicFramePr/>
                 <a:graphic xmlns:a="http://schemas.openxmlformats.org/drawingml/2006/main">
                   <a:graphicData uri="http://schemas.microsoft.com/office/word/2010/wordprocessingShape">
@@ -3796,7 +3905,7 @@
                       <wps:spPr>
                         <a:xfrm>
                           <a:off x="0" y="0"/>
-                          <a:ext cx="4819650" cy="1591310"/>
+                          <a:ext cx="561975" cy="187739"/>
                         </a:xfrm>
                         <a:prstGeom prst="rect">
                           <a:avLst/>
@@ -3833,18 +3942,15 @@
                     </wps:wsp>
                   </a:graphicData>
                 </a:graphic>
-                <wp14:sizeRelH relativeFrom="margin">
-                  <wp14:pctWidth>0</wp14:pctWidth>
-                </wp14:sizeRelH>
                 <wp14:sizeRelV relativeFrom="margin">
                   <wp14:pctHeight>0</wp14:pctHeight>
                 </wp14:sizeRelV>
               </wp:anchor>
             </w:drawing>
           </mc:Choice>
-          <mc:Fallback xmlns:w16sdtfl="http://schemas.microsoft.com/office/word/2024/wordml/sdtformatlock" xmlns:w16du="http://schemas.microsoft.com/office/word/2023/wordml/word16du" xmlns:oel="http://schemas.microsoft.com/office/2019/extlst">
+          <mc:Fallback>
             <w:pict>
-              <v:rect w14:anchorId="319677E9" id="Rectangle 8" o:spid="_x0000_s1026" style="position:absolute;margin-left:35.5pt;margin-top:2.55pt;width:379.5pt;height:125.3pt;z-index:251670528;visibility:visible;mso-wrap-style:square;mso-width-percent:0;mso-height-percent:0;mso-wrap-distance-left:9pt;mso-wrap-distance-top:0;mso-wrap-distance-right:9pt;mso-wrap-distance-bottom:0;mso-position-horizontal:absolute;mso-position-horizontal-relative:text;mso-position-vertical:absolute;mso-position-vertical-relative:text;mso-width-percent:0;mso-height-percent:0;mso-width-relative:margin;mso-height-relative:margin;v-text-anchor:middle" o:gfxdata="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" filled="f" strokecolor="#e00" strokeweight="1pt"/>
+              <v:rect w14:anchorId="36222D8C" id="Rectangle 8" o:spid="_x0000_s1026" style="position:absolute;margin-left:204.55pt;margin-top:4.5pt;width:44.25pt;height:14.8pt;z-index:251666432;visibility:visible;mso-wrap-style:square;mso-height-percent:0;mso-wrap-distance-left:9pt;mso-wrap-distance-top:0;mso-wrap-distance-right:9pt;mso-wrap-distance-bottom:0;mso-position-horizontal:absolute;mso-position-horizontal-relative:text;mso-position-vertical:absolute;mso-position-vertical-relative:text;mso-height-percent:0;mso-height-relative:margin;v-text-anchor:middle" o:gfxdata="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" filled="f" strokecolor="#e00" strokeweight="1pt"/>
             </w:pict>
           </mc:Fallback>
         </mc:AlternateContent>
@@ -3856,27 +3962,6 @@
           <w:rFonts w:ascii="Times New Roman" w:hAnsi="Times New Roman" w:cs="Times New Roman"/>
         </w:rPr>
       </w:pPr>
-    </w:p>
-    <w:p>
-      <w:pPr>
-        <w:rPr>
-          <w:rFonts w:ascii="Times New Roman" w:hAnsi="Times New Roman" w:cs="Times New Roman"/>
-        </w:rPr>
-      </w:pPr>
-    </w:p>
-    <w:p>
-      <w:pPr>
-        <w:rPr>
-          <w:rFonts w:ascii="Times New Roman" w:hAnsi="Times New Roman" w:cs="Times New Roman"/>
-        </w:rPr>
-      </w:pPr>
-    </w:p>
-    <w:p>
-      <w:pPr>
-        <w:rPr>
-          <w:rFonts w:ascii="Times New Roman" w:hAnsi="Times New Roman" w:cs="Times New Roman"/>
-        </w:rPr>
-      </w:pPr>
       <w:r>
         <w:rPr>
           <w:rFonts w:ascii="Times New Roman" w:hAnsi="Times New Roman" w:cs="Times New Roman"/>
@@ -3885,18 +3970,18 @@
         <mc:AlternateContent>
           <mc:Choice Requires="wps">
             <w:drawing>
-              <wp:anchor distT="0" distB="0" distL="114300" distR="114300" simplePos="0" relativeHeight="251666432" behindDoc="0" locked="0" layoutInCell="1" allowOverlap="1" wp14:anchorId="703FB720" wp14:editId="58A2694C">
+              <wp:anchor distT="0" distB="0" distL="114300" distR="114300" simplePos="0" relativeHeight="251672576" behindDoc="0" locked="0" layoutInCell="1" allowOverlap="1" wp14:anchorId="176D0A32" wp14:editId="11A54C7D">
                 <wp:simplePos x="0" y="0"/>
-                <wp:positionH relativeFrom="column">
-                  <wp:posOffset>2586990</wp:posOffset>
+                <wp:positionH relativeFrom="margin">
+                  <wp:posOffset>357809</wp:posOffset>
                 </wp:positionH>
                 <wp:positionV relativeFrom="paragraph">
-                  <wp:posOffset>28575</wp:posOffset>
+                  <wp:posOffset>207314</wp:posOffset>
                 </wp:positionV>
-                <wp:extent cx="561975" cy="223520"/>
-                <wp:effectExtent l="0" t="0" r="28575" b="24130"/>
+                <wp:extent cx="5044771" cy="1423283"/>
+                <wp:effectExtent l="0" t="0" r="22860" b="24765"/>
                 <wp:wrapNone/>
-                <wp:docPr id="1109464233" name="Rectangle 8"/>
+                <wp:docPr id="1138602842" name="Rectangle 8"/>
                 <wp:cNvGraphicFramePr/>
                 <a:graphic xmlns:a="http://schemas.openxmlformats.org/drawingml/2006/main">
                   <a:graphicData uri="http://schemas.microsoft.com/office/word/2010/wordprocessingShape">
@@ -3905,7 +3990,7 @@
                       <wps:spPr>
                         <a:xfrm>
                           <a:off x="0" y="0"/>
-                          <a:ext cx="561975" cy="223520"/>
+                          <a:ext cx="5044771" cy="1423283"/>
                         </a:xfrm>
                         <a:prstGeom prst="rect">
                           <a:avLst/>
@@ -3942,12 +4027,20 @@
                     </wps:wsp>
                   </a:graphicData>
                 </a:graphic>
+                <wp14:sizeRelH relativeFrom="margin">
+                  <wp14:pctWidth>0</wp14:pctWidth>
+                </wp14:sizeRelH>
+                <wp14:sizeRelV relativeFrom="margin">
+                  <wp14:pctHeight>0</wp14:pctHeight>
+                </wp14:sizeRelV>
               </wp:anchor>
             </w:drawing>
           </mc:Choice>
-          <mc:Fallback xmlns:w16sdtfl="http://schemas.microsoft.com/office/word/2024/wordml/sdtformatlock" xmlns:w16du="http://schemas.microsoft.com/office/word/2023/wordml/word16du" xmlns:oel="http://schemas.microsoft.com/office/2019/extlst">
+          <mc:Fallback>
             <w:pict>
-              <v:rect w14:anchorId="00E2FCEB" id="Rectangle 8" o:spid="_x0000_s1026" style="position:absolute;margin-left:203.7pt;margin-top:2.25pt;width:44.25pt;height:17.6pt;z-index:251666432;visibility:visible;mso-wrap-style:square;mso-wrap-distance-left:9pt;mso-wrap-distance-top:0;mso-wrap-distance-right:9pt;mso-wrap-distance-bottom:0;mso-position-horizontal:absolute;mso-position-horizontal-relative:text;mso-position-vertical:absolute;mso-position-vertical-relative:text;v-text-anchor:middle" o:gfxdata="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" filled="f" strokecolor="#e00" strokeweight="1pt"/>
+              <v:rect w14:anchorId="324DDF1C" id="Rectangle 8" o:spid="_x0000_s1026" style="position:absolute;margin-left:28.15pt;margin-top:16.3pt;width:397.25pt;height:112.05pt;z-index:251672576;visibility:visible;mso-wrap-style:square;mso-width-percent:0;mso-height-percent:0;mso-wrap-distance-left:9pt;mso-wrap-distance-top:0;mso-wrap-distance-right:9pt;mso-wrap-distance-bottom:0;mso-position-horizontal:absolute;mso-position-horizontal-relative:margin;mso-position-vertical:absolute;mso-position-vertical-relative:text;mso-width-percent:0;mso-height-percent:0;mso-width-relative:margin;mso-height-relative:margin;v-text-anchor:middle" o:gfxdata="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" filled="f" strokecolor="#e00" strokeweight="1pt">
+                <w10:wrap anchorx="margin"/>
+              </v:rect>
             </w:pict>
           </mc:Fallback>
         </mc:AlternateContent>
@@ -3959,6 +4052,34 @@
           <w:rFonts w:ascii="Times New Roman" w:hAnsi="Times New Roman" w:cs="Times New Roman"/>
         </w:rPr>
       </w:pPr>
+    </w:p>
+    <w:p>
+      <w:pPr>
+        <w:rPr>
+          <w:rFonts w:ascii="Times New Roman" w:hAnsi="Times New Roman" w:cs="Times New Roman"/>
+        </w:rPr>
+      </w:pPr>
+    </w:p>
+    <w:p>
+      <w:pPr>
+        <w:rPr>
+          <w:rFonts w:ascii="Times New Roman" w:hAnsi="Times New Roman" w:cs="Times New Roman"/>
+        </w:rPr>
+      </w:pPr>
+    </w:p>
+    <w:p>
+      <w:pPr>
+        <w:rPr>
+          <w:rFonts w:ascii="Times New Roman" w:hAnsi="Times New Roman" w:cs="Times New Roman"/>
+        </w:rPr>
+      </w:pPr>
+    </w:p>
+    <w:p>
+      <w:pPr>
+        <w:rPr>
+          <w:rFonts w:ascii="Times New Roman" w:hAnsi="Times New Roman" w:cs="Times New Roman"/>
+        </w:rPr>
+      </w:pPr>
       <w:r>
         <w:rPr>
           <w:rFonts w:ascii="Times New Roman" w:hAnsi="Times New Roman" w:cs="Times New Roman"/>
@@ -3967,18 +4088,18 @@
         <mc:AlternateContent>
           <mc:Choice Requires="wps">
             <w:drawing>
-              <wp:anchor distT="0" distB="0" distL="114300" distR="114300" simplePos="0" relativeHeight="251672576" behindDoc="0" locked="0" layoutInCell="1" allowOverlap="1" wp14:anchorId="176D0A32" wp14:editId="340948BE">
+              <wp:anchor distT="0" distB="0" distL="114300" distR="114300" simplePos="0" relativeHeight="251674624" behindDoc="0" locked="0" layoutInCell="1" allowOverlap="1" wp14:anchorId="0C0C1BBE" wp14:editId="02AD2547">
                 <wp:simplePos x="0" y="0"/>
                 <wp:positionH relativeFrom="margin">
-                  <wp:align>center</wp:align>
+                  <wp:posOffset>365760</wp:posOffset>
                 </wp:positionH>
                 <wp:positionV relativeFrom="paragraph">
-                  <wp:posOffset>205105</wp:posOffset>
+                  <wp:posOffset>230476</wp:posOffset>
                 </wp:positionV>
-                <wp:extent cx="4819650" cy="1774613"/>
-                <wp:effectExtent l="0" t="0" r="19050" b="16510"/>
+                <wp:extent cx="5035053" cy="2138901"/>
+                <wp:effectExtent l="0" t="0" r="13335" b="13970"/>
                 <wp:wrapNone/>
-                <wp:docPr id="1138602842" name="Rectangle 8"/>
+                <wp:docPr id="251601883" name="Rectangle 8"/>
                 <wp:cNvGraphicFramePr/>
                 <a:graphic xmlns:a="http://schemas.openxmlformats.org/drawingml/2006/main">
                   <a:graphicData uri="http://schemas.microsoft.com/office/word/2010/wordprocessingShape">
@@ -3987,7 +4108,7 @@
                       <wps:spPr>
                         <a:xfrm>
                           <a:off x="0" y="0"/>
-                          <a:ext cx="4819650" cy="1774613"/>
+                          <a:ext cx="5035053" cy="2138901"/>
                         </a:xfrm>
                         <a:prstGeom prst="rect">
                           <a:avLst/>
@@ -4033,9 +4154,9 @@
               </wp:anchor>
             </w:drawing>
           </mc:Choice>
-          <mc:Fallback xmlns:w16sdtfl="http://schemas.microsoft.com/office/word/2024/wordml/sdtformatlock" xmlns:w16du="http://schemas.microsoft.com/office/word/2023/wordml/word16du" xmlns:oel="http://schemas.microsoft.com/office/2019/extlst">
+          <mc:Fallback>
             <w:pict>
-              <v:rect w14:anchorId="6A26EC6C" id="Rectangle 8" o:spid="_x0000_s1026" style="position:absolute;margin-left:0;margin-top:16.15pt;width:379.5pt;height:139.75pt;z-index:251672576;visibility:visible;mso-wrap-style:square;mso-width-percent:0;mso-height-percent:0;mso-wrap-distance-left:9pt;mso-wrap-distance-top:0;mso-wrap-distance-right:9pt;mso-wrap-distance-bottom:0;mso-position-horizontal:center;mso-position-horizontal-relative:margin;mso-position-vertical:absolute;mso-position-vertical-relative:text;mso-width-percent:0;mso-height-percent:0;mso-width-relative:margin;mso-height-relative:margin;v-text-anchor:middle" o:gfxdata="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" filled="f" strokecolor="#e00" strokeweight="1pt">
+              <v:rect w14:anchorId="212C9EEE" id="Rectangle 8" o:spid="_x0000_s1026" style="position:absolute;margin-left:28.8pt;margin-top:18.15pt;width:396.45pt;height:168.4pt;z-index:251674624;visibility:visible;mso-wrap-style:square;mso-width-percent:0;mso-height-percent:0;mso-wrap-distance-left:9pt;mso-wrap-distance-top:0;mso-wrap-distance-right:9pt;mso-wrap-distance-bottom:0;mso-position-horizontal:absolute;mso-position-horizontal-relative:margin;mso-position-vertical:absolute;mso-position-vertical-relative:text;mso-width-percent:0;mso-height-percent:0;mso-width-relative:margin;mso-height-relative:margin;v-text-anchor:middle" o:gfxdata="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" filled="f" strokecolor="#e00" strokeweight="1pt">
                 <w10:wrap anchorx="margin"/>
               </v:rect>
             </w:pict>
@@ -4049,34 +4170,6 @@
           <w:rFonts w:ascii="Times New Roman" w:hAnsi="Times New Roman" w:cs="Times New Roman"/>
         </w:rPr>
       </w:pPr>
-    </w:p>
-    <w:p>
-      <w:pPr>
-        <w:rPr>
-          <w:rFonts w:ascii="Times New Roman" w:hAnsi="Times New Roman" w:cs="Times New Roman"/>
-        </w:rPr>
-      </w:pPr>
-    </w:p>
-    <w:p>
-      <w:pPr>
-        <w:rPr>
-          <w:rFonts w:ascii="Times New Roman" w:hAnsi="Times New Roman" w:cs="Times New Roman"/>
-        </w:rPr>
-      </w:pPr>
-    </w:p>
-    <w:p>
-      <w:pPr>
-        <w:rPr>
-          <w:rFonts w:ascii="Times New Roman" w:hAnsi="Times New Roman" w:cs="Times New Roman"/>
-        </w:rPr>
-      </w:pPr>
-    </w:p>
-    <w:p>
-      <w:pPr>
-        <w:rPr>
-          <w:rFonts w:ascii="Times New Roman" w:hAnsi="Times New Roman" w:cs="Times New Roman"/>
-        </w:rPr>
-      </w:pPr>
       <w:r>
         <w:rPr>
           <w:rFonts w:ascii="Times New Roman" w:hAnsi="Times New Roman" w:cs="Times New Roman"/>
@@ -4085,18 +4178,18 @@
         <mc:AlternateContent>
           <mc:Choice Requires="wps">
             <w:drawing>
-              <wp:anchor distT="0" distB="0" distL="114300" distR="114300" simplePos="0" relativeHeight="251668480" behindDoc="0" locked="0" layoutInCell="1" allowOverlap="1" wp14:anchorId="54D8E98F" wp14:editId="51617502">
+              <wp:anchor distT="0" distB="0" distL="114300" distR="114300" simplePos="0" relativeHeight="251759616" behindDoc="0" locked="0" layoutInCell="1" allowOverlap="1" wp14:anchorId="0C465FD7" wp14:editId="37018A6D">
                 <wp:simplePos x="0" y="0"/>
                 <wp:positionH relativeFrom="margin">
-                  <wp:posOffset>2570480</wp:posOffset>
+                  <wp:posOffset>1101891</wp:posOffset>
                 </wp:positionH>
                 <wp:positionV relativeFrom="paragraph">
-                  <wp:posOffset>87630</wp:posOffset>
+                  <wp:posOffset>220345</wp:posOffset>
                 </wp:positionV>
-                <wp:extent cx="561975" cy="223520"/>
-                <wp:effectExtent l="0" t="0" r="28575" b="24130"/>
+                <wp:extent cx="337931" cy="135172"/>
+                <wp:effectExtent l="0" t="0" r="24130" b="17780"/>
                 <wp:wrapNone/>
-                <wp:docPr id="1847717897" name="Rectangle 8"/>
+                <wp:docPr id="30" name="Rectangle 8"/>
                 <wp:cNvGraphicFramePr/>
                 <a:graphic xmlns:a="http://schemas.openxmlformats.org/drawingml/2006/main">
                   <a:graphicData uri="http://schemas.microsoft.com/office/word/2010/wordprocessingShape">
@@ -4105,7 +4198,7 @@
                       <wps:spPr>
                         <a:xfrm>
                           <a:off x="0" y="0"/>
-                          <a:ext cx="561975" cy="223520"/>
+                          <a:ext cx="337931" cy="135172"/>
                         </a:xfrm>
                         <a:prstGeom prst="rect">
                           <a:avLst/>
@@ -4142,25 +4235,24 @@
                     </wps:wsp>
                   </a:graphicData>
                 </a:graphic>
+                <wp14:sizeRelH relativeFrom="margin">
+                  <wp14:pctWidth>0</wp14:pctWidth>
+                </wp14:sizeRelH>
+                <wp14:sizeRelV relativeFrom="margin">
+                  <wp14:pctHeight>0</wp14:pctHeight>
+                </wp14:sizeRelV>
               </wp:anchor>
             </w:drawing>
           </mc:Choice>
-          <mc:Fallback xmlns:w16sdtfl="http://schemas.microsoft.com/office/word/2024/wordml/sdtformatlock" xmlns:w16du="http://schemas.microsoft.com/office/word/2023/wordml/word16du" xmlns:oel="http://schemas.microsoft.com/office/2019/extlst">
+          <mc:Fallback>
             <w:pict>
-              <v:rect w14:anchorId="64F76FE2" id="Rectangle 8" o:spid="_x0000_s1026" style="position:absolute;margin-left:202.4pt;margin-top:6.9pt;width:44.25pt;height:17.6pt;z-index:251668480;visibility:visible;mso-wrap-style:square;mso-wrap-distance-left:9pt;mso-wrap-distance-top:0;mso-wrap-distance-right:9pt;mso-wrap-distance-bottom:0;mso-position-horizontal:absolute;mso-position-horizontal-relative:margin;mso-position-vertical:absolute;mso-position-vertical-relative:text;v-text-anchor:middle" o:gfxdata="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" filled="f" strokecolor="#e00" strokeweight="1pt">
+              <v:rect w14:anchorId="0DDAC278" id="Rectangle 8" o:spid="_x0000_s1026" style="position:absolute;margin-left:86.75pt;margin-top:17.35pt;width:26.6pt;height:10.65pt;z-index:251759616;visibility:visible;mso-wrap-style:square;mso-width-percent:0;mso-height-percent:0;mso-wrap-distance-left:9pt;mso-wrap-distance-top:0;mso-wrap-distance-right:9pt;mso-wrap-distance-bottom:0;mso-position-horizontal:absolute;mso-position-horizontal-relative:margin;mso-position-vertical:absolute;mso-position-vertical-relative:text;mso-width-percent:0;mso-height-percent:0;mso-width-relative:margin;mso-height-relative:margin;v-text-anchor:middle" o:gfxdata="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" filled="f" strokecolor="#e00" strokeweight="1pt">
                 <w10:wrap anchorx="margin"/>
               </v:rect>
             </w:pict>
           </mc:Fallback>
         </mc:AlternateContent>
       </w:r>
-    </w:p>
-    <w:p>
-      <w:pPr>
-        <w:rPr>
-          <w:rFonts w:ascii="Times New Roman" w:hAnsi="Times New Roman" w:cs="Times New Roman"/>
-        </w:rPr>
-      </w:pPr>
       <w:r>
         <w:rPr>
           <w:rFonts w:ascii="Times New Roman" w:hAnsi="Times New Roman" w:cs="Times New Roman"/>
@@ -4169,18 +4261,18 @@
         <mc:AlternateContent>
           <mc:Choice Requires="wps">
             <w:drawing>
-              <wp:anchor distT="0" distB="0" distL="114300" distR="114300" simplePos="0" relativeHeight="251674624" behindDoc="0" locked="0" layoutInCell="1" allowOverlap="1" wp14:anchorId="0C0C1BBE" wp14:editId="14C2B444">
+              <wp:anchor distT="0" distB="0" distL="114300" distR="114300" simplePos="0" relativeHeight="251668480" behindDoc="0" locked="0" layoutInCell="1" allowOverlap="1" wp14:anchorId="54D8E98F" wp14:editId="08A16EC9">
                 <wp:simplePos x="0" y="0"/>
                 <wp:positionH relativeFrom="margin">
-                  <wp:posOffset>438150</wp:posOffset>
+                  <wp:posOffset>4315626</wp:posOffset>
                 </wp:positionH>
                 <wp:positionV relativeFrom="paragraph">
-                  <wp:posOffset>269875</wp:posOffset>
+                  <wp:posOffset>220345</wp:posOffset>
                 </wp:positionV>
-                <wp:extent cx="4813300" cy="1631950"/>
-                <wp:effectExtent l="0" t="0" r="25400" b="25400"/>
+                <wp:extent cx="337931" cy="135172"/>
+                <wp:effectExtent l="0" t="0" r="24130" b="17780"/>
                 <wp:wrapNone/>
-                <wp:docPr id="251601883" name="Rectangle 8"/>
+                <wp:docPr id="1847717897" name="Rectangle 8"/>
                 <wp:cNvGraphicFramePr/>
                 <a:graphic xmlns:a="http://schemas.openxmlformats.org/drawingml/2006/main">
                   <a:graphicData uri="http://schemas.microsoft.com/office/word/2010/wordprocessingShape">
@@ -4189,7 +4281,7 @@
                       <wps:spPr>
                         <a:xfrm>
                           <a:off x="0" y="0"/>
-                          <a:ext cx="4813300" cy="1631950"/>
+                          <a:ext cx="337931" cy="135172"/>
                         </a:xfrm>
                         <a:prstGeom prst="rect">
                           <a:avLst/>
@@ -4235,9 +4327,9 @@
               </wp:anchor>
             </w:drawing>
           </mc:Choice>
-          <mc:Fallback xmlns:w16sdtfl="http://schemas.microsoft.com/office/word/2024/wordml/sdtformatlock" xmlns:w16du="http://schemas.microsoft.com/office/word/2023/wordml/word16du" xmlns:oel="http://schemas.microsoft.com/office/2019/extlst">
+          <mc:Fallback>
             <w:pict>
-              <v:rect w14:anchorId="7102B62B" id="Rectangle 8" o:spid="_x0000_s1026" style="position:absolute;margin-left:34.5pt;margin-top:21.25pt;width:379pt;height:128.5pt;z-index:251674624;visibility:visible;mso-wrap-style:square;mso-width-percent:0;mso-height-percent:0;mso-wrap-distance-left:9pt;mso-wrap-distance-top:0;mso-wrap-distance-right:9pt;mso-wrap-distance-bottom:0;mso-position-horizontal:absolute;mso-position-horizontal-relative:margin;mso-position-vertical:absolute;mso-position-vertical-relative:text;mso-width-percent:0;mso-height-percent:0;mso-width-relative:margin;mso-height-relative:margin;v-text-anchor:middle" o:gfxdata="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" filled="f" strokecolor="#e00" strokeweight="1pt">
+              <v:rect w14:anchorId="0046CE1E" id="Rectangle 8" o:spid="_x0000_s1026" style="position:absolute;margin-left:339.8pt;margin-top:17.35pt;width:26.6pt;height:10.65pt;z-index:251668480;visibility:visible;mso-wrap-style:square;mso-width-percent:0;mso-height-percent:0;mso-wrap-distance-left:9pt;mso-wrap-distance-top:0;mso-wrap-distance-right:9pt;mso-wrap-distance-bottom:0;mso-position-horizontal:absolute;mso-position-horizontal-relative:margin;mso-position-vertical:absolute;mso-position-vertical-relative:text;mso-width-percent:0;mso-height-percent:0;mso-width-relative:margin;mso-height-relative:margin;v-text-anchor:middle" o:gfxdata="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" filled="f" strokecolor="#e00" strokeweight="1pt">
                 <w10:wrap anchorx="margin"/>
               </v:rect>
             </w:pict>
@@ -5742,7 +5834,7 @@
           </mc:Choice>
           <mc:Fallback>
             <w:pict>
-              <v:rect w14:anchorId="7165777A" id="Rectangle 18" o:spid="_x0000_s1026" style="position:absolute;margin-left:268.25pt;margin-top:18.1pt;width:49.95pt;height:12.5pt;z-index:251756544;visibility:visible;mso-wrap-style:square;mso-width-percent:0;mso-height-percent:0;mso-wrap-distance-left:9pt;mso-wrap-distance-top:0;mso-wrap-distance-right:9pt;mso-wrap-distance-bottom:0;mso-position-horizontal:absolute;mso-position-horizontal-relative:text;mso-position-vertical:absolute;mso-position-vertical-relative:text;mso-width-percent:0;mso-height-percent:0;mso-width-relative:margin;mso-height-relative:margin;v-text-anchor:middle" o:gfxdata="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" filled="f" strokecolor="#e00" strokeweight="1pt"/>
+              <v:rect w14:anchorId="545040AC" id="Rectangle 18" o:spid="_x0000_s1026" style="position:absolute;margin-left:268.25pt;margin-top:18.1pt;width:49.95pt;height:12.5pt;z-index:251756544;visibility:visible;mso-wrap-style:square;mso-width-percent:0;mso-height-percent:0;mso-wrap-distance-left:9pt;mso-wrap-distance-top:0;mso-wrap-distance-right:9pt;mso-wrap-distance-bottom:0;mso-position-horizontal:absolute;mso-position-horizontal-relative:text;mso-position-vertical:absolute;mso-position-vertical-relative:text;mso-width-percent:0;mso-height-percent:0;mso-width-relative:margin;mso-height-relative:margin;v-text-anchor:middle" o:gfxdata="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" filled="f" strokecolor="#e00" strokeweight="1pt"/>
             </w:pict>
           </mc:Fallback>
         </mc:AlternateContent>
@@ -6083,7 +6175,7 @@
           </mc:Choice>
           <mc:Fallback>
             <w:pict>
-              <v:rect w14:anchorId="2BCC2221" id="Rectangle 18" o:spid="_x0000_s1026" style="position:absolute;margin-left:104.75pt;margin-top:7.4pt;width:105.15pt;height:10.9pt;z-index:251709440;visibility:visible;mso-wrap-style:square;mso-width-percent:0;mso-height-percent:0;mso-wrap-distance-left:9pt;mso-wrap-distance-top:0;mso-wrap-distance-right:9pt;mso-wrap-distance-bottom:0;mso-position-horizontal:absolute;mso-position-horizontal-relative:text;mso-position-vertical:absolute;mso-position-vertical-relative:text;mso-width-percent:0;mso-height-percent:0;mso-width-relative:margin;mso-height-relative:margin;v-text-anchor:middle" o:gfxdata="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" filled="f" strokecolor="#e00" strokeweight="1pt"/>
+              <v:rect w14:anchorId="556F9014" id="Rectangle 18" o:spid="_x0000_s1026" style="position:absolute;margin-left:104.75pt;margin-top:7.4pt;width:105.15pt;height:10.9pt;z-index:251709440;visibility:visible;mso-wrap-style:square;mso-width-percent:0;mso-height-percent:0;mso-wrap-distance-left:9pt;mso-wrap-distance-top:0;mso-wrap-distance-right:9pt;mso-wrap-distance-bottom:0;mso-position-horizontal:absolute;mso-position-horizontal-relative:text;mso-position-vertical:absolute;mso-position-vertical-relative:text;mso-width-percent:0;mso-height-percent:0;mso-width-relative:margin;mso-height-relative:margin;v-text-anchor:middle" o:gfxdata="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" filled="f" strokecolor="#e00" strokeweight="1pt"/>
             </w:pict>
           </mc:Fallback>
         </mc:AlternateContent>

</xml_diff>